<commit_message>
CR v0.5: render with new CR Word template (cover says Change Request), fix As-Is numbering and background; add PDF preview
Co-Authored-By: Claude Opus 5.5 <noreply@anthropic.com>
Claude-Session: https://claude.ai/code/session_01SLkyCeSeV96w3aeCje3oHa
</commit_message>
<xml_diff>
--- a/docs/CR-2026-XXX-PEV/CR-2026-XXX-PEV_CR_v0.5.docx
+++ b/docs/CR-2026-XXX-PEV/CR-2026-XXX-PEV_CR_v0.5.docx
@@ -50,7 +50,7 @@
           <w:color w:val="1F3A5F"/>
           <w:sz w:val="44"/>
         </w:rPr>
-        <w:t>Software Requirements Specification</w:t>
+        <w:t>Change Request</w:t>
       </w:r>
     </w:p>
     <w:p>
@@ -63,7 +63,7 @@
           <w:color w:val="1F3A5F"/>
           <w:sz w:val="32"/>
         </w:rPr>
-        <w:t>Automated Employee Probation Evaluation – Change Request</w:t>
+        <w:t>Automated Employee Probation Evaluation</w:t>
       </w:r>
     </w:p>
     <w:p/>
@@ -1734,7 +1734,7 @@
     <w:p>
       <w:pPr/>
       <w:r>
-        <w:t>Employees joining SKMCH serve a probation period. Before the probation end date, the employee's supervisor must evaluate the employee so that HR can decide on confirmation. The requested change automates this: the system starts the evaluation on time, routes it through the approval hierarchy and delivers it to HR, while keeping the probation request status current at every step (M-01 to M-08). How the process is run today (manual forms, e-mail or an existing screen) was not described in the request (Q-02).</w:t>
+        <w:t>Employees joining SKMCH serve a probation period. Before the probation end date, the employee's supervisor must evaluate the employee so that HR can decide on confirmation. Today this is done through an e-mailed alert with an Excel evaluation form (see 1.3). The requested change moves the evaluation online: the system starts it automatically, routes it through the approval hierarchy, delivers it to HR and keeps its status up to date (M-01 to M-13).</w:t>
       </w:r>
     </w:p>
     <w:p>
@@ -1747,10 +1747,16 @@
     </w:p>
     <w:p>
       <w:pPr>
-        <w:pStyle w:val="ListNumber"/>
-      </w:pPr>
-      <w:r>
-        <w:t xml:space="preserve">A probation-ending alert is e-mailed </w:t>
+        <w:pStyle w:val="ListBullet"/>
+      </w:pPr>
+      <w:r>
+        <w:rPr>
+          <w:b/>
+        </w:rPr>
+        <w:t>Step 1:</w:t>
+      </w:r>
+      <w:r>
+        <w:t xml:space="preserve"> A probation-ending alert is e-mailed </w:t>
       </w:r>
       <w:r>
         <w:rPr>
@@ -1793,10 +1799,16 @@
     </w:p>
     <w:p>
       <w:pPr>
-        <w:pStyle w:val="ListNumber"/>
-      </w:pPr>
-      <w:r>
-        <w:t>The concerned person (supervisor) fills in the Excel form and sends it back by e-mail as feedback. The form's main sections are:</w:t>
+        <w:pStyle w:val="ListBullet"/>
+      </w:pPr>
+      <w:r>
+        <w:rPr>
+          <w:b/>
+        </w:rPr>
+        <w:t>Step 2:</w:t>
+      </w:r>
+      <w:r>
+        <w:t xml:space="preserve"> The concerned person (supervisor) fills in the Excel form and sends it back by e-mail as feedback. The form's main sections are:</w:t>
       </w:r>
     </w:p>
     <w:p>
@@ -1825,10 +1837,16 @@
     </w:p>
     <w:p>
       <w:pPr>
-        <w:pStyle w:val="ListNumber"/>
-      </w:pPr>
-      <w:r>
-        <w:t>HR follows up manually, then records the confirm/extend decision on form S07FRM00362 (</w:t>
+        <w:pStyle w:val="ListBullet"/>
+      </w:pPr>
+      <w:r>
+        <w:rPr>
+          <w:b/>
+        </w:rPr>
+        <w:t>Step 3:</w:t>
+      </w:r>
+      <w:r>
+        <w:t xml:space="preserve"> HR follows up manually, then records the confirm/extend decision on form S07FRM00362 (</w:t>
       </w:r>
       <w:r>
         <w:rPr>
@@ -1853,10 +1871,16 @@
     </w:p>
     <w:p>
       <w:pPr>
-        <w:pStyle w:val="ListNumber"/>
-      </w:pPr>
-      <w:r>
-        <w:t>Approvals above the supervisor are obtained outside the system, and nobody can see where an evaluation stands.</w:t>
+        <w:pStyle w:val="ListBullet"/>
+      </w:pPr>
+      <w:r>
+        <w:rPr>
+          <w:b/>
+        </w:rPr>
+        <w:t>Step 4:</w:t>
+      </w:r>
+      <w:r>
+        <w:t xml:space="preserve"> Approvals above the supervisor are obtained outside the system, and nobody can see where an evaluation stands.</w:t>
       </w:r>
     </w:p>
     <w:p>
@@ -8910,7 +8934,7 @@
       <w:rPr>
         <w:sz w:val="16"/>
       </w:rPr>
-      <w:t>Shaukat Khanum Memorial Cancer Hospital &amp; Research Centre  |  Software Requirements Specification  |  CR-2026-XXX-PEV  v0.5</w:t>
+      <w:t>Shaukat Khanum Memorial Cancer Hospital &amp; Research Centre  |  Change Request  |  CR-2026-XXX-PEV  v0.5</w:t>
     </w:r>
   </w:p>
 </w:hdr>

</xml_diff>